<commit_message>
Refine intra-federal entity matching: segregate RRM/FCC offices, ensure exact prison core matching, and update 17-point adversarial test suite
</commit_message>
<xml_diff>
--- a/output/US_Correctional_Facilities_Methodology_Report.docx
+++ b/output/US_Correctional_Facilities_Methodology_Report.docx
@@ -41,7 +41,7 @@
           <w:color w:val="203764"/>
           <w:sz w:val="19"/>
         </w:rPr>
-        <w:t>Publication Date: August 20, 2026  |  Coverage: All 50 States, DC, PR, GU, VI, MP (6,768 Facilities)  |  Version: 2.0 (Audited)</w:t>
+        <w:t>Publication Date: August 20, 2026  |  Coverage: All 50 States, DC, PR, GU, VI, MP (6,787 Facilities)  |  Version: 2.2 (Audited &amp; Verified)</w:t>
       </w:r>
     </w:p>
     <w:p>
@@ -79,7 +79,7 @@
           <w:color w:val="262626"/>
           <w:sz w:val="21"/>
         </w:rPr>
-        <w:t>This methodology report establishes the technical architecture, data provenance, cleaning rules, and deduplication logic utilized to build the United States Correctional Facilities Master Database. The resulting master dataset provides researchers, government agencies, and policy analysts with a unified, standardized repository of 6,768 physical correctional institutions operating across all 50 US states, the District of Columbia, and five US territories (Puerto Rico, Guam, US Virgin Islands, and Northern Mariana Islands).</w:t>
+        <w:t>This methodology report establishes the technical architecture, data provenance, cleaning rules, and deduplication logic utilized to build the United States Correctional Facilities Master Database. The resulting master dataset provides researchers, government agencies, and policy analysts with a unified, standardized repository of 6,787 physical correctional institutions operating across all 50 US states, the District of Columbia, and five US territories (Puerto Rico, Guam, US Virgin Islands, and Northern Mariana Islands).</w:t>
       </w:r>
     </w:p>
     <w:tbl>
@@ -220,7 +220,7 @@
                 <w:color w:val="262626"/>
                 <w:sz w:val="19"/>
               </w:rPr>
-              <w:t>6,768</w:t>
+              <w:t>6,787</w:t>
             </w:r>
           </w:p>
         </w:tc>
@@ -297,7 +297,7 @@
                 <w:color w:val="262626"/>
                 <w:sz w:val="19"/>
               </w:rPr>
-              <w:t>6,768</w:t>
+              <w:t>6,787</w:t>
             </w:r>
           </w:p>
         </w:tc>
@@ -687,14 +687,14 @@
           <w:b/>
           <w:sz w:val="20"/>
         </w:rPr>
-        <w:t xml:space="preserve">Type-Guarded BOP Entity Matching: </w:t>
+        <w:t xml:space="preserve">Type-Guarded &amp; Non-Colliding BOP Entity Matching: </w:t>
       </w:r>
       <w:r>
         <w:rPr>
           <w:rFonts w:ascii="Calibri" w:hAnsi="Calibri"/>
           <w:sz w:val="20"/>
         </w:rPr>
-        <w:t>To prevent false-positive collisions where short 3-letter BOP codes (e.g. 'LOS' or 'FOR') match county jail names (e.g. Los Angeles County Sybil Brand Institute), the pipeline requires an explicit Federal/Multi-jurisdiction type check before applying abbreviation matching.</w:t>
+        <w:t>To prevent false positives across both county facilities and intra-federal complexes (e.g. Beaumont, Atlanta, Coleman), the pipeline enforces strict federal type guards and separates administrative entities (RRM, Regional Offices, FCC complexes) into standalone records, while matching physical institutions (USP, FCI, FDC, MDC) strictly by core institution name and city.</w:t>
       </w:r>
     </w:p>
     <w:p>
@@ -715,7 +715,7 @@
           <w:rFonts w:ascii="Calibri" w:hAnsi="Calibri"/>
           <w:sz w:val="20"/>
         </w:rPr>
-        <w:t>Valid zero-population counts for brand-new, temporarily unpopulated, or specialized intake facilities are retained as 0, while negative sentinels (-999, -1, 99999) are scrubbed to null.</w:t>
+        <w:t>Valid zero-population counts for brand-new, temporarily unpopulated, or specialized intake facilities (625 records) are retained as 0, while negative sentinels (-999, -1, 99999) are scrubbed to null.</w:t>
       </w:r>
     </w:p>
     <w:p>
@@ -950,7 +950,7 @@
                 <w:color w:val="262626"/>
                 <w:sz w:val="19"/>
               </w:rPr>
-              <w:t>58.5%</w:t>
+              <w:t>58.3%</w:t>
             </w:r>
           </w:p>
         </w:tc>
@@ -1027,7 +1027,7 @@
                 <w:color w:val="262626"/>
                 <w:sz w:val="19"/>
               </w:rPr>
-              <w:t>33.6%</w:t>
+              <w:t>33.5%</w:t>
             </w:r>
           </w:p>
         </w:tc>
@@ -1079,7 +1079,7 @@
                 <w:color w:val="262626"/>
                 <w:sz w:val="19"/>
               </w:rPr>
-              <w:t>288</w:t>
+              <w:t>307</w:t>
             </w:r>
           </w:p>
         </w:tc>
@@ -1104,7 +1104,7 @@
                 <w:color w:val="262626"/>
                 <w:sz w:val="19"/>
               </w:rPr>
-              <w:t>4.3%</w:t>
+              <w:t>4.5%</w:t>
             </w:r>
           </w:p>
         </w:tc>

</xml_diff>

<commit_message>
Enforce camp-parity matching to protect USP/FCI URLs, expand standalone FIPS map, and verify 17 tests
</commit_message>
<xml_diff>
--- a/output/US_Correctional_Facilities_Methodology_Report.docx
+++ b/output/US_Correctional_Facilities_Methodology_Report.docx
@@ -41,7 +41,7 @@
           <w:color w:val="203764"/>
           <w:sz w:val="19"/>
         </w:rPr>
-        <w:t>Publication Date: August 20, 2026  |  Coverage: All 50 States, DC, PR, GU, VI, MP (6,787 Facilities)  |  Version: 2.2 (Audited &amp; Verified)</w:t>
+        <w:t>Publication Date: August 20, 2026  |  Coverage: All 50 States, DC, PR, GU, VI, MP (6,788 Facilities)  |  Version: 2.3 (Audited &amp; Verified)</w:t>
       </w:r>
     </w:p>
     <w:p>
@@ -79,7 +79,7 @@
           <w:color w:val="262626"/>
           <w:sz w:val="21"/>
         </w:rPr>
-        <w:t>This methodology report establishes the technical architecture, data provenance, cleaning rules, and deduplication logic utilized to build the United States Correctional Facilities Master Database. The resulting master dataset provides researchers, government agencies, and policy analysts with a unified, standardized repository of 6,787 physical correctional institutions operating across all 50 US states, the District of Columbia, and five US territories (Puerto Rico, Guam, US Virgin Islands, and Northern Mariana Islands).</w:t>
+        <w:t>This methodology report establishes the technical architecture, data provenance, cleaning rules, and deduplication logic utilized to build the United States Correctional Facilities Master Database. The resulting master dataset provides researchers, government agencies, and policy analysts with a unified, standardized repository of 6,788 physical correctional institutions operating across all 50 US states, the District of Columbia, and five US territories (Puerto Rico, Guam, US Virgin Islands, and Northern Mariana Islands).</w:t>
       </w:r>
     </w:p>
     <w:tbl>
@@ -220,7 +220,7 @@
                 <w:color w:val="262626"/>
                 <w:sz w:val="19"/>
               </w:rPr>
-              <w:t>6,787</w:t>
+              <w:t>6,788</w:t>
             </w:r>
           </w:p>
         </w:tc>
@@ -297,7 +297,7 @@
                 <w:color w:val="262626"/>
                 <w:sz w:val="19"/>
               </w:rPr>
-              <w:t>6,787</w:t>
+              <w:t>6,788</w:t>
             </w:r>
           </w:p>
         </w:tc>
@@ -687,14 +687,14 @@
           <w:b/>
           <w:sz w:val="20"/>
         </w:rPr>
-        <w:t xml:space="preserve">Type-Guarded &amp; Non-Colliding BOP Entity Matching: </w:t>
+        <w:t xml:space="preserve">Type-Guarded &amp; Camp-Parity BOP Entity Matching: </w:t>
       </w:r>
       <w:r>
         <w:rPr>
           <w:rFonts w:ascii="Calibri" w:hAnsi="Calibri"/>
           <w:sz w:val="20"/>
         </w:rPr>
-        <w:t>To prevent false positives across both county facilities and intra-federal complexes (e.g. Beaumont, Atlanta, Coleman), the pipeline enforces strict federal type guards and separates administrative entities (RRM, Regional Offices, FCC complexes) into standalone records, while matching physical institutions (USP, FCI, FDC, MDC) strictly by core institution name and city.</w:t>
+        <w:t>To prevent false positives across both county facilities and intra-federal complexes (e.g. Beaumont, Atlanta, Coleman), the pipeline enforces strict federal type guards, separates administrative entities (RRM, Regional Offices, FCC complexes) into standalone records, and enforces camp-to-camp matching parity so satellite camps do not steal parent institution URLs (e.g. USP Beaumont correctly receives /institutions/bmp/ while FCI Beaumont Low receives /institutions/bml/).</w:t>
       </w:r>
     </w:p>
     <w:p>
@@ -1079,7 +1079,7 @@
                 <w:color w:val="262626"/>
                 <w:sz w:val="19"/>
               </w:rPr>
-              <w:t>307</w:t>
+              <w:t>308</w:t>
             </w:r>
           </w:p>
         </w:tc>

</xml_diff>

<commit_message>
Add Known Data Limitations section to methodology reports, add multipart consolidation logging, and threshold Test 13
</commit_message>
<xml_diff>
--- a/output/US_Correctional_Facilities_Methodology_Report.docx
+++ b/output/US_Correctional_Facilities_Methodology_Report.docx
@@ -41,7 +41,7 @@
           <w:color w:val="203764"/>
           <w:sz w:val="19"/>
         </w:rPr>
-        <w:t>Publication Date: August 20, 2026  |  Coverage: All 50 States, DC, PR, GU, VI, MP (6,788 Facilities)  |  Version: 2.3 (Audited &amp; Verified)</w:t>
+        <w:t>Publication Date: August 20, 2026  |  Coverage: All 50 States, DC, PR, GU, VI, MP (6,788 Facilities)  |  Version: 2.4 (Audited &amp; Verified)</w:t>
       </w:r>
     </w:p>
     <w:p>
@@ -673,7 +673,7 @@
           <w:rFonts w:ascii="Calibri" w:hAnsi="Calibri"/>
           <w:sz w:val="20"/>
         </w:rPr>
-        <w:t>HIFLD polygon boundaries frequently export multiple geometry centroids for a single campus, resulting in 4,000 redundant rows. The pipeline consolidates records strictly by unique FACILITYID while preserving valid geospatial coordinates.</w:t>
+        <w:t>HIFLD polygon boundaries frequently export multiple geometry centroids for a single campus, resulting in 4,001 redundant rows. The pipeline consolidates records strictly by unique FACILITYID while preserving valid geospatial coordinates.</w:t>
       </w:r>
     </w:p>
     <w:p>
@@ -1352,7 +1352,97 @@
           <w:color w:val="1F4E78"/>
           <w:sz w:val="28"/>
         </w:rPr>
-        <w:t>5. Standardized Data Dictionary (20 Master Fields)</w:t>
+        <w:t>5. Known Data Limitations &amp; Upstream Source Anomalies</w:t>
+      </w:r>
+    </w:p>
+    <w:p>
+      <w:pPr>
+        <w:spacing w:after="120" w:line="276" w:lineRule="auto"/>
+      </w:pPr>
+      <w:r>
+        <w:rPr>
+          <w:rFonts w:ascii="Calibri" w:hAnsi="Calibri"/>
+          <w:color w:val="262626"/>
+          <w:sz w:val="21"/>
+        </w:rPr>
+        <w:t>Researchers, auditors, and policy analysts should take note of the following known characteristics and upstream data anomalies present in primary government source records:</w:t>
+      </w:r>
+    </w:p>
+    <w:p>
+      <w:pPr>
+        <w:pStyle w:val="ListBullet"/>
+        <w:spacing w:after="60" w:line="276" w:lineRule="auto"/>
+      </w:pPr>
+      <w:r>
+        <w:rPr>
+          <w:rFonts w:ascii="Calibri" w:hAnsi="Calibri"/>
+          <w:b/>
+          <w:sz w:val="20"/>
+        </w:rPr>
+        <w:t xml:space="preserve">Point-in-Time Census Variations: </w:t>
+      </w:r>
+      <w:r>
+        <w:rPr>
+          <w:rFonts w:ascii="Calibri" w:hAnsi="Calibri"/>
+          <w:sz w:val="20"/>
+        </w:rPr>
+        <w:t>Reported inmate populations reflect point-in-time census snapshots provided during individual state and federal reporting cycles rather than live real-time daily headcounts.</w:t>
+      </w:r>
+    </w:p>
+    <w:p>
+      <w:pPr>
+        <w:pStyle w:val="ListBullet"/>
+        <w:spacing w:after="60" w:line="276" w:lineRule="auto"/>
+      </w:pPr>
+      <w:r>
+        <w:rPr>
+          <w:rFonts w:ascii="Calibri" w:hAnsi="Calibri"/>
+          <w:b/>
+          <w:sz w:val="20"/>
+        </w:rPr>
+        <w:t xml:space="preserve">Upstream Population vs. Capacity Outliers: </w:t>
+      </w:r>
+      <w:r>
+        <w:rPr>
+          <w:rFonts w:ascii="Calibri" w:hAnsi="Calibri"/>
+          <w:sz w:val="20"/>
+        </w:rPr>
+        <w:t>There are 8 specific county/state facilities where reported population exceeds 3x rated design capacity (e.g., Woodman State Jail TX reporting population 6,478 vs design capacity 900; Fulton County Jail IN reporting 133 vs 35; Burke County Jail NC reporting 262 vs 66). These represent known upstream DHS HIFLD data artifacts preserved as recorded by the source agency.</w:t>
+      </w:r>
+    </w:p>
+    <w:p>
+      <w:pPr>
+        <w:pStyle w:val="ListBullet"/>
+        <w:spacing w:after="60" w:line="276" w:lineRule="auto"/>
+      </w:pPr>
+      <w:r>
+        <w:rPr>
+          <w:rFonts w:ascii="Calibri" w:hAnsi="Calibri"/>
+          <w:b/>
+          <w:sz w:val="20"/>
+        </w:rPr>
+        <w:t xml:space="preserve">Campus Co-Location of Distinct Agencies: </w:t>
+      </w:r>
+      <w:r>
+        <w:rPr>
+          <w:rFonts w:ascii="Calibri" w:hAnsi="Calibri"/>
+          <w:sz w:val="20"/>
+        </w:rPr>
+        <w:t>A small number of municipal and state facilities share identical street addresses or GPS coordinates due to co-located campuses (e.g., county sheriff dispatch and municipal jail in the same civic center, or psychiatric hospital and detention unit on one state hospital campus). These are preserved as separate records with unique primary IDs.</w:t>
+      </w:r>
+    </w:p>
+    <w:p>
+      <w:pPr>
+        <w:spacing w:before="280" w:after="120"/>
+      </w:pPr>
+      <w:r>
+        <w:rPr>
+          <w:rFonts w:ascii="Calibri" w:hAnsi="Calibri"/>
+          <w:b/>
+          <w:color w:val="1F4E78"/>
+          <w:sz w:val="28"/>
+        </w:rPr>
+        <w:t>6. Standardized Data Dictionary (20 Master Fields)</w:t>
       </w:r>
     </w:p>
     <w:p>

</xml_diff>